<commit_message>
feat: fix color theme/font size/merge cells/registry/table APIs and test document
</commit_message>
<xml_diff>
--- a/test/features/steps/test_files/sty-known-styles.docx
+++ b/test/features/steps/test_files/sty-known-styles.docx
@@ -40,7 +40,7 @@
 </file>
 
 <file path=word/styles.xml><?xml version="1.0" encoding="utf-8"?>
-<w:styles xmlns:mc="http://schemas.openxmlformats.org/markup-compatibility/2006" xmlns:r="http://schemas.openxmlformats.org/officeDocument/2006/relationships" xmlns:w="http://schemas.openxmlformats.org/wordprocessingml/2006/main" xmlns:w14="http://schemas.microsoft.com/office/word/2010/wordml" mc:Ignorable="w14">
+<w:styles xmlns:ns1="http://schemas.openxmlformats.org/markup-compatibility/2006" xmlns:w="http://schemas.openxmlformats.org/wordprocessingml/2006/main" ns1:Ignorable="w14">
   <w:docDefaults>
     <w:rPrDefault>
       <w:rPr>
@@ -255,13 +255,11 @@
   <w:style w:type="paragraph" w:customStyle="1" w:styleId="SubNormal">
     <w:name w:val="Sub Normal"/>
     <w:basedOn w:val="Normal"/>
-    <w:next w:val="Foobar"/>
     <w:qFormat/>
     <w:rsid w:val="00AF7ABB"/>
   </w:style>
   <w:style w:type="paragraph" w:customStyle="1" w:styleId="Foo">
     <w:name w:val="Foo"/>
-    <w:next w:val="Base"/>
   </w:style>
 </w:styles>
 </file>

</xml_diff>